<commit_message>
agents and LLM update
</commit_message>
<xml_diff>
--- a/Project_VERA_Proposal.docx
+++ b/Project_VERA_Proposal.docx
@@ -216,7 +216,12 @@
     </w:p>
     <w:p>
       <w:r>
-        <w:t>Project VERA (Virtual Engineering Review Agent) is a Multi-Agent System designed to address the critical challenge of document inconsistency in any technical or regulated industry. In fast-paced engineering environments — including semiconductor manufacturing, aerospace, pharmaceuticals, and automotive — official product specifications frequently become outdated when teams make critical decisions through informal channels such as email communications. This creates a dangerous gap between documented specifications and actual operating parameters, potentially leading to quality issues, safety hazards, and regulatory non-compliance. The included demonstration uses a semiconductor scenario, but the architecture is fully domain-agnostic.</w:t>
+        <w:t>Project VERA v2.0 (Virtual Engineering Review Agent) is a production-grade, multi-agent AI system designed to automate technical document auditing, cross-reference checking, and compliance verification. It addresses the critical challenge of documentation drift in regulated industries by autonomously auditing live database records against official specifications and informal email communications.</w:t>
+      </w:r>
+    </w:p>
+    <w:p>
+      <w:r>
+        <w:t>The system features a domain-agnostic core architecture, "Information Lock" grounding to eliminate hallucinations, and strictly immutable Domain Isolation. VERA v2.0 supports local (Ollama) and cloud (Gemini, Groq) LLM backends, making it adaptable to diverse security and performance requirements.</w:t>
       </w:r>
     </w:p>
     <w:p>
@@ -250,6 +255,30 @@
         <w:pStyle w:val="ListBullet"/>
       </w:pPr>
       <w:r>
+        <w:t>🛡️ Information Lock protocol to ensure zero hallucinations</w:t>
+      </w:r>
+    </w:p>
+    <w:p>
+      <w:pPr>
+        <w:pStyle w:val="ListBullet"/>
+      </w:pPr>
+      <w:r>
+        <w:t>🏝️ Immutable Domain Isolation to prevent unauthorized domain bleed</w:t>
+      </w:r>
+    </w:p>
+    <w:p>
+      <w:pPr>
+        <w:pStyle w:val="ListBullet"/>
+      </w:pPr>
+      <w:r>
+        <w:t>🗄️ Enterprise-grade decoupling of structured (SQL) and unstructured (Vector) data</w:t>
+      </w:r>
+    </w:p>
+    <w:p>
+      <w:pPr>
+        <w:pStyle w:val="ListBullet"/>
+      </w:pPr>
+      <w:r>
         <w:t>Automatic discrepancy detection between datasheets and internal emails</w:t>
       </w:r>
     </w:p>
@@ -259,14 +288,6 @@
       </w:pPr>
       <w:r>
         <w:t>Human escalation pathway for unauthorized access attempts</w:t>
-      </w:r>
-    </w:p>
-    <w:p>
-      <w:pPr>
-        <w:pStyle w:val="ListBullet"/>
-      </w:pPr>
-      <w:r>
-        <w:t>Email context analysis to surface informal engineering decisions</w:t>
       </w:r>
     </w:p>
     <w:p>
@@ -1282,12 +1303,12 @@
         <w:pStyle w:val="Heading2"/>
       </w:pPr>
       <w:r>
-        <w:t>7.1 Layer 1 — Router Security Check</w:t>
+        <w:t>7.1 Layer 1 — Hybrid Router Security</w:t>
       </w:r>
     </w:p>
     <w:p>
       <w:r>
-        <w:t>The Router Agent uses deterministic keyword matching to classify the user's query intent (technical vs compliance). For security checks, the LLM analyzes whether a junior user's query implies access to restricted information. If flagged, the query is routed directly to the escalation handler.</w:t>
+        <w:t>The Router Agent employs a hybrid classification strategy: deterministic keyword matching for speed, followed by LLM-based intent fallback for ambiguous queries. For security, the LLM analyzes whether a junior user's query implies access to restricted information. If flagged, the query is routed directly to the escalation handler.</w:t>
       </w:r>
     </w:p>
     <w:p>
@@ -1458,12 +1479,38 @@
         <w:pStyle w:val="Heading2"/>
       </w:pPr>
       <w:r>
-        <w:t>7.3 Layer 3 — Escalation</w:t>
+        <w:t>7.3 Layer 3 — Domain Isolation</w:t>
       </w:r>
     </w:p>
     <w:p>
       <w:r>
-        <w:t>When the security check flags a query, the workflow bypasses all retrieval and generation nodes, routing directly to the escalation handler. The handler returns a structured escalation notice and logs the event for audit purposes.</w:t>
+        <w:t>To prevent "Domain Bleed," VERA treats the user's assigned domain as immutable. Even if a query contains keywords from another domain, the system strictly restricts retrieval to the authorized domain, escalating any detection of cross-domain intent to a supervisor node.</w:t>
+      </w:r>
+    </w:p>
+    <w:p>
+      <w:pPr>
+        <w:pStyle w:val="Heading2"/>
+      </w:pPr>
+      <w:r>
+        <w:t>7.4 Layer 4 — Information Lock (Grounding)</w:t>
+      </w:r>
+    </w:p>
+    <w:p>
+      <w:r>
+        <w:t>The "Information Lock" is a grounding-first protocol that ensures the system only responds using facts explicitly found in provided documents or database records. If the required information is missing, the system is hard-coded to respond with a standardized "Data Not Found" message rather than inferring or using external training data.</w:t>
+      </w:r>
+    </w:p>
+    <w:p>
+      <w:pPr>
+        <w:pStyle w:val="Heading2"/>
+      </w:pPr>
+      <w:r>
+        <w:t>7.5 Layer 5 — Escalation</w:t>
+      </w:r>
+    </w:p>
+    <w:p>
+      <w:r>
+        <w:t>When security checks or domain isolation flags a query, the workflow bypasses retrieval and generation, routing directly to the escalation handler.</w:t>
       </w:r>
     </w:p>
     <w:p>
@@ -1693,6 +1740,38 @@
           </w:tcPr>
           <w:p>
             <w:r>
+              <w:t>Groq</w:t>
+            </w:r>
+          </w:p>
+        </w:tc>
+        <w:tc>
+          <w:tcPr>
+            <w:tcW w:type="dxa" w:w="2880"/>
+          </w:tcPr>
+          <w:p>
+            <w:r>
+              <w:t>High-speed cloud inference (Option B)</w:t>
+            </w:r>
+          </w:p>
+        </w:tc>
+        <w:tc>
+          <w:tcPr>
+            <w:tcW w:type="dxa" w:w="2880"/>
+          </w:tcPr>
+          <w:p>
+            <w:r>
+              <w:t>Latest</w:t>
+            </w:r>
+          </w:p>
+        </w:tc>
+      </w:tr>
+      <w:tr>
+        <w:tc>
+          <w:tcPr>
+            <w:tcW w:type="dxa" w:w="2880"/>
+          </w:tcPr>
+          <w:p>
+            <w:r>
               <w:t>Ollama</w:t>
             </w:r>
           </w:p>
@@ -1703,7 +1782,7 @@
           </w:tcPr>
           <w:p>
             <w:r>
-              <w:t>Local LLM + Embeddings (Option B)</w:t>
+              <w:t>Local LLM + Embeddings (Option C)</w:t>
             </w:r>
           </w:p>
         </w:tc>
@@ -1754,7 +1833,7 @@
     <w:p/>
     <w:p>
       <w:r>
-        <w:t>VERA supports a dual-backend architecture: users can choose between Google Gemini (cloud API with higher model quality) or Ollama (100% local execution with no API key, no rate limits, and no internet required). The LLM_BACKEND environment variable controls which backend is used for both LLM inference and embedding generation.</w:t>
+        <w:t>VERA supports a multi-backend architecture: users can choose between Google Gemini (cloud API), Groq (high-speed Llama-3.3 inference), or Ollama (100% local execution). The LLM_BACKEND environment variable controls which backend is used for inference.</w:t>
       </w:r>
     </w:p>
     <w:p>

</xml_diff>

<commit_message>
enhance response, discrepancy and documents
</commit_message>
<xml_diff>
--- a/Project_VERA_Proposal.docx
+++ b/Project_VERA_Proposal.docx
@@ -216,12 +216,12 @@
     </w:p>
     <w:p>
       <w:r>
-        <w:t>Project VERA v2.0 (Virtual Engineering Review Agent) is a production-grade, multi-agent AI system designed to automate technical document auditing, cross-reference checking, and compliance verification. It addresses the critical challenge of documentation drift in regulated industries by autonomously auditing live database records against official specifications and informal email communications.</w:t>
+        <w:t>Project VERA v2.5 (Virtual Engineering Review Agent) is a production-grade, multi-agent AI system designed to automate technical document auditing, cross-reference checking, and compliance verification. It addresses the critical challenge of documentation drift in regulated industries by autonomously auditing live database records against official specifications and informal email communications.</w:t>
       </w:r>
     </w:p>
     <w:p>
       <w:r>
-        <w:t>The system features a domain-agnostic core architecture, "Information Lock" grounding to eliminate hallucinations, and strictly immutable Domain Isolation. VERA v2.0 supports local (Ollama) and cloud (Gemini, Groq) LLM backends, making it adaptable to diverse security and performance requirements.</w:t>
+        <w:t>The system features a "Surgical Router" architecture for domain-isolated processing, "Information Lock" grounding to eliminate hallucinations, and a deterministic "Triangulation Discrepancy Engine." VERA v2.5 supports local (Ollama) and cloud (Gemini, Groq) LLM backends, making it adaptable to diverse security and performance requirements.</w:t>
       </w:r>
     </w:p>
     <w:p>
@@ -511,7 +511,7 @@
         <w:pStyle w:val="ListBullet"/>
       </w:pPr>
       <w:r>
-        <w:t>Router Agent: Performs LLM-based NER and surgical routing to domain subchains</w:t>
+        <w:t>Surgical Router: Performs LLM-based NER and surgical routing to domain clusters</w:t>
       </w:r>
     </w:p>
     <w:p>
@@ -519,7 +519,7 @@
         <w:pStyle w:val="ListBullet"/>
       </w:pPr>
       <w:r>
-        <w:t>DB Agent: Executes natural language to SQL queries on domain databases</w:t>
+        <w:t>DB Agent Cluster: Executes natural language to SQL queries on domain databases</w:t>
       </w:r>
     </w:p>
     <w:p>
@@ -527,7 +527,7 @@
         <w:pStyle w:val="ListBullet"/>
       </w:pPr>
       <w:r>
-        <w:t>Official Docs Agent: Extracts high-precision facts from datasheets and manuals</w:t>
+        <w:t>Official Docs Cluster: Extracts high-precision facts from datasheets and manuals</w:t>
       </w:r>
     </w:p>
     <w:p>
@@ -535,7 +535,7 @@
         <w:pStyle w:val="ListBullet"/>
       </w:pPr>
       <w:r>
-        <w:t>Informal Docs Agent: Researches engineering emails and informal memos</w:t>
+        <w:t>Informal Docs Cluster: Researches engineering emails and informal memos</w:t>
       </w:r>
     </w:p>
     <w:p>
@@ -551,7 +551,7 @@
         <w:pStyle w:val="ListBullet"/>
       </w:pPr>
       <w:r>
-        <w:t>Discrepancy Agent: Performs final audit and cross-source conflict detection</w:t>
+        <w:t>Triangulation Engine: Performs final audit and deterministic conflict detection</w:t>
       </w:r>
     </w:p>
     <w:p>
@@ -677,7 +677,7 @@
           </w:tcPr>
           <w:p>
             <w:r>
-              <w:t>Router Agent</w:t>
+              <w:t>Surgical Router</w:t>
             </w:r>
           </w:p>
         </w:tc>
@@ -687,7 +687,7 @@
           </w:tcPr>
           <w:p>
             <w:r>
-              <w:t>LLM-NER (Entity/Attr) + Surgical Routing</w:t>
+              <w:t>LLM-NER (Entity/Attr) + Cluster Delegation</w:t>
             </w:r>
           </w:p>
         </w:tc>
@@ -709,7 +709,7 @@
           </w:tcPr>
           <w:p>
             <w:r>
-              <w:t>DB Agent</w:t>
+              <w:t>DB Cluster</w:t>
             </w:r>
           </w:p>
         </w:tc>
@@ -741,7 +741,7 @@
           </w:tcPr>
           <w:p>
             <w:r>
-              <w:t>Official Agent</w:t>
+              <w:t>Official Cluster</w:t>
             </w:r>
           </w:p>
         </w:tc>
@@ -805,7 +805,7 @@
           </w:tcPr>
           <w:p>
             <w:r>
-              <w:t>Generator + Auditor</w:t>
+              <w:t>Triangulation</w:t>
             </w:r>
           </w:p>
         </w:tc>
@@ -815,7 +815,7 @@
           </w:tcPr>
           <w:p>
             <w:r>
-              <w:t>Response synthesis + Discrepancy audit</w:t>
+              <w:t>Deterministic audit using authority hierarchy</w:t>
             </w:r>
           </w:p>
         </w:tc>
@@ -913,7 +913,7 @@
           </w:tcPr>
           <w:p>
             <w:r>
-              <w:t>Router</w:t>
+              <w:t>Surgical Router</w:t>
             </w:r>
           </w:p>
         </w:tc>
@@ -943,7 +943,7 @@
           </w:tcPr>
           <w:p>
             <w:r>
-              <w:t>Route + NER + Security Flag</w:t>
+              <w:t>Route + NER + Cluster Flag</w:t>
             </w:r>
           </w:p>
         </w:tc>
@@ -955,7 +955,7 @@
           </w:tcPr>
           <w:p>
             <w:r>
-              <w:t>DB Agent</w:t>
+              <w:t>DB Cluster</w:t>
             </w:r>
           </w:p>
         </w:tc>
@@ -985,7 +985,7 @@
           </w:tcPr>
           <w:p>
             <w:r>
-              <w:t>SQL Results as Structured Facts</w:t>
+              <w:t>SQL Results (Priority 3)</w:t>
             </w:r>
           </w:p>
         </w:tc>
@@ -1027,7 +1027,7 @@
           </w:tcPr>
           <w:p>
             <w:r>
-              <w:t>Precise Specifications</w:t>
+              <w:t>Specs (Priority 2)</w:t>
             </w:r>
           </w:p>
         </w:tc>
@@ -1069,7 +1069,7 @@
           </w:tcPr>
           <w:p>
             <w:r>
-              <w:t>Email-based Decisions</w:t>
+              <w:t>Memos (Priority 1)</w:t>
             </w:r>
           </w:p>
         </w:tc>
@@ -1111,7 +1111,7 @@
           </w:tcPr>
           <w:p>
             <w:r>
-              <w:t>LLM Report</w:t>
+              <w:t>LLM Report (Grounded)</w:t>
             </w:r>
           </w:p>
         </w:tc>
@@ -1123,7 +1123,7 @@
           </w:tcPr>
           <w:p>
             <w:r>
-              <w:t>Discrepancy</w:t>
+              <w:t>Triangulation</w:t>
             </w:r>
           </w:p>
         </w:tc>
@@ -1143,7 +1143,7 @@
           </w:tcPr>
           <w:p>
             <w:r>
-              <w:t>All Facts + Report</w:t>
+              <w:t>All Facts</w:t>
             </w:r>
           </w:p>
         </w:tc>
@@ -1153,7 +1153,7 @@
           </w:tcPr>
           <w:p>
             <w:r>
-              <w:t>Audit Verdict</w:t>
+              <w:t>Verdict (Deterministic)</w:t>
             </w:r>
           </w:p>
         </w:tc>

</xml_diff>